<commit_message>
Limpieza nivel 2: documentos de planificación y resúmenes de sprint a docs/, script de exportación a scripts/ y enlaces actualizados
</commit_message>
<xml_diff>
--- a/reports/joan/informe_tecnico.docx
+++ b/reports/joan/informe_tecnico.docx
@@ -62,7 +62,7 @@
     <w:p>
       <w:pPr>
         <w:pStyle w:val="NormalWeb"/>
-        <w:divId w:val="1553082832"/>
+        <w:divId w:val="612053104"/>
         <w:rPr>
           <w:lang w:val="es-ES"/>
         </w:rPr>
@@ -105,7 +105,7 @@
           <w:rFonts w:eastAsia="Times New Roman"/>
           <w:lang w:val="es-ES"/>
         </w:rPr>
-        <w:pict w14:anchorId="3C7B4B04">
+        <w:pict w14:anchorId="2C907499">
           <v:rect id="_x0000_i1025" style="width:0;height:1.5pt" o:hralign="center" o:hrstd="t" o:hr="t" fillcolor="#a0a0a0" stroked="f"/>
         </w:pict>
       </w:r>
@@ -788,7 +788,7 @@
           <w:rFonts w:eastAsia="Times New Roman"/>
           <w:lang w:val="es-ES"/>
         </w:rPr>
-        <w:pict w14:anchorId="60F9B5BD">
+        <w:pict w14:anchorId="3CD5ECC5">
           <v:rect id="_x0000_i1026" style="width:0;height:1.5pt" o:hralign="center" o:hrstd="t" o:hr="t" fillcolor="#a0a0a0" stroked="f"/>
         </w:pict>
       </w:r>
@@ -1054,7 +1054,7 @@
           <w:rFonts w:eastAsia="Times New Roman"/>
           <w:lang w:val="es-ES"/>
         </w:rPr>
-        <w:pict w14:anchorId="66BDF2F8">
+        <w:pict w14:anchorId="75E91D93">
           <v:rect id="_x0000_i1027" style="width:0;height:1.5pt" o:hralign="center" o:hrstd="t" o:hr="t" fillcolor="#a0a0a0" stroked="f"/>
         </w:pict>
       </w:r>
@@ -2026,7 +2026,7 @@
           <w:rFonts w:eastAsia="Times New Roman"/>
           <w:lang w:val="es-ES"/>
         </w:rPr>
-        <w:pict w14:anchorId="201EEFBC">
+        <w:pict w14:anchorId="0B2092B5">
           <v:rect id="_x0000_i1028" style="width:0;height:1.5pt" o:hralign="center" o:hrstd="t" o:hr="t" fillcolor="#a0a0a0" stroked="f"/>
         </w:pict>
       </w:r>
@@ -2060,7 +2060,7 @@
           <w:lang w:val="es-ES"/>
         </w:rPr>
         <w:drawing>
-          <wp:inline distT="0" distB="0" distL="0" distR="0" wp14:anchorId="5DDFB864" wp14:editId="75511CE7">
+          <wp:inline distT="0" distB="0" distL="0" distR="0" wp14:anchorId="7BA8D86E" wp14:editId="61BA41B2">
             <wp:extent cx="6264910" cy="1519871"/>
             <wp:effectExtent l="0" t="0" r="2540" b="4445"/>
             <wp:docPr id="5" name="Imagen 5" descr="Perfil horario"/>
@@ -2360,7 +2360,7 @@
           <w:rFonts w:eastAsia="Times New Roman"/>
           <w:lang w:val="es-ES"/>
         </w:rPr>
-        <w:pict w14:anchorId="3FCF1E23">
+        <w:pict w14:anchorId="3D295659">
           <v:rect id="_x0000_i1030" style="width:0;height:1.5pt" o:hralign="center" o:hrstd="t" o:hr="t" fillcolor="#a0a0a0" stroked="f"/>
         </w:pict>
       </w:r>
@@ -2814,7 +2814,7 @@
           <w:rFonts w:eastAsia="Times New Roman"/>
           <w:lang w:val="es-ES"/>
         </w:rPr>
-        <w:pict w14:anchorId="07C3E8AE">
+        <w:pict w14:anchorId="75E25884">
           <v:rect id="_x0000_i1031" style="width:0;height:1.5pt" o:hralign="center" o:hrstd="t" o:hr="t" fillcolor="#a0a0a0" stroked="f"/>
         </w:pict>
       </w:r>
@@ -5451,7 +5451,7 @@
           <w:lang w:val="es-ES"/>
         </w:rPr>
         <w:drawing>
-          <wp:inline distT="0" distB="0" distL="0" distR="0" wp14:anchorId="01C20506" wp14:editId="6C24BBED">
+          <wp:inline distT="0" distB="0" distL="0" distR="0" wp14:anchorId="076AA509" wp14:editId="17CCC1A9">
             <wp:extent cx="6264910" cy="1739286"/>
             <wp:effectExtent l="0" t="0" r="2540" b="0"/>
             <wp:docPr id="8" name="Imagen 8" descr="RMSLE por fold"/>
@@ -6382,7 +6382,7 @@
           <w:rFonts w:eastAsia="Times New Roman"/>
           <w:lang w:val="es-ES"/>
         </w:rPr>
-        <w:pict w14:anchorId="4FDEA92B">
+        <w:pict w14:anchorId="2ECC17BB">
           <v:rect id="_x0000_i1033" style="width:0;height:1.5pt" o:hralign="center" o:hrstd="t" o:hr="t" fillcolor="#a0a0a0" stroked="f"/>
         </w:pict>
       </w:r>
@@ -6585,7 +6585,7 @@
           <w:lang w:val="es-ES"/>
         </w:rPr>
         <w:drawing>
-          <wp:inline distT="0" distB="0" distL="0" distR="0" wp14:anchorId="2C0CB1E0" wp14:editId="3676395A">
+          <wp:inline distT="0" distB="0" distL="0" distR="0" wp14:anchorId="66B73CDE" wp14:editId="7795C2FF">
             <wp:extent cx="6264910" cy="1474486"/>
             <wp:effectExtent l="0" t="0" r="2540" b="0"/>
             <wp:docPr id="10" name="Imagen 10" descr="Elección de k"/>
@@ -6646,7 +6646,7 @@
           <w:rFonts w:eastAsia="Times New Roman"/>
           <w:lang w:val="es-ES"/>
         </w:rPr>
-        <w:pict w14:anchorId="618C3241">
+        <w:pict w14:anchorId="09837547">
           <v:rect id="_x0000_i1035" style="width:0;height:1.5pt" o:hralign="center" o:hrstd="t" o:hr="t" fillcolor="#a0a0a0" stroked="f"/>
         </w:pict>
       </w:r>
@@ -7327,7 +7327,7 @@
           <w:rFonts w:eastAsia="Times New Roman"/>
           <w:lang w:val="es-ES"/>
         </w:rPr>
-        <w:pict w14:anchorId="5A70E006">
+        <w:pict w14:anchorId="1336D726">
           <v:rect id="_x0000_i1036" style="width:0;height:1.5pt" o:hralign="center" o:hrstd="t" o:hr="t" fillcolor="#a0a0a0" stroked="f"/>
         </w:pict>
       </w:r>
@@ -8379,7 +8379,7 @@
           <w:lang w:val="es-ES"/>
         </w:rPr>
         <w:drawing>
-          <wp:inline distT="0" distB="0" distL="0" distR="0" wp14:anchorId="374F1C0C" wp14:editId="6B141E55">
+          <wp:inline distT="0" distB="0" distL="0" distR="0" wp14:anchorId="39E882AE" wp14:editId="4A5B9143">
             <wp:extent cx="6264910" cy="1741610"/>
             <wp:effectExtent l="0" t="0" r="2540" b="0"/>
             <wp:docPr id="13" name="Imagen 13" descr="RMSLE mensual en test"/>
@@ -9036,7 +9036,7 @@
           <w:rFonts w:eastAsia="Times New Roman"/>
           <w:lang w:val="es-ES"/>
         </w:rPr>
-        <w:pict w14:anchorId="55BF7598">
+        <w:pict w14:anchorId="5A9BA9E8">
           <v:rect id="_x0000_i1038" style="width:0;height:1.5pt" o:hralign="center" o:hrstd="t" o:hr="t" fillcolor="#a0a0a0" stroked="f"/>
         </w:pict>
       </w:r>
@@ -9109,7 +9109,7 @@
           <w:lang w:val="es-ES"/>
         </w:rPr>
         <w:drawing>
-          <wp:inline distT="0" distB="0" distL="0" distR="0" wp14:anchorId="2D0F28F4" wp14:editId="115591D0">
+          <wp:inline distT="0" distB="0" distL="0" distR="0" wp14:anchorId="20D2037F" wp14:editId="0411792C">
             <wp:extent cx="6264910" cy="1739286"/>
             <wp:effectExtent l="0" t="0" r="2540" b="0"/>
             <wp:docPr id="15" name="Imagen 15" descr="Errores en test"/>
@@ -9275,7 +9275,7 @@
           <w:lang w:val="es-ES"/>
         </w:rPr>
         <w:drawing>
-          <wp:inline distT="0" distB="0" distL="0" distR="0" wp14:anchorId="385A6B98" wp14:editId="2421E6BB">
+          <wp:inline distT="0" distB="0" distL="0" distR="0" wp14:anchorId="3D87F4AB" wp14:editId="5BB2CA33">
             <wp:extent cx="4060466" cy="2603500"/>
             <wp:effectExtent l="0" t="0" r="0" b="6350"/>
             <wp:docPr id="16" name="Imagen 16" descr="SHAP"/>
@@ -9369,7 +9369,7 @@
           <w:rFonts w:eastAsia="Times New Roman"/>
           <w:lang w:val="es-ES"/>
         </w:rPr>
-        <w:pict w14:anchorId="13908BE5">
+        <w:pict w14:anchorId="678E88D9">
           <v:rect id="_x0000_i1041" style="width:0;height:1.5pt" o:hralign="center" o:hrstd="t" o:hr="t" fillcolor="#a0a0a0" stroked="f"/>
         </w:pict>
       </w:r>
@@ -10124,7 +10124,7 @@
           <w:lang w:val="es-ES"/>
         </w:rPr>
         <w:drawing>
-          <wp:inline distT="0" distB="0" distL="0" distR="0" wp14:anchorId="2B538C5C" wp14:editId="2B21FDC2">
+          <wp:inline distT="0" distB="0" distL="0" distR="0" wp14:anchorId="6224EB3C" wp14:editId="41498191">
             <wp:extent cx="5332219" cy="2603500"/>
             <wp:effectExtent l="0" t="0" r="1905" b="6350"/>
             <wp:docPr id="18" name="Imagen 18" descr="Sensibilidad al clima"/>
@@ -10262,7 +10262,7 @@
           <w:lang w:val="es-ES"/>
         </w:rPr>
         <w:drawing>
-          <wp:inline distT="0" distB="0" distL="0" distR="0" wp14:anchorId="0E192875" wp14:editId="69E00117">
+          <wp:inline distT="0" distB="0" distL="0" distR="0" wp14:anchorId="57EF6090" wp14:editId="5C4B8144">
             <wp:extent cx="6264910" cy="1829729"/>
             <wp:effectExtent l="0" t="0" r="2540" b="0"/>
             <wp:docPr id="19" name="Imagen 19" descr="Dos días reales"/>
@@ -10451,7 +10451,7 @@
           <w:lang w:val="es-ES"/>
         </w:rPr>
         <w:drawing>
-          <wp:inline distT="0" distB="0" distL="0" distR="0" wp14:anchorId="6D3E311B" wp14:editId="1C950CF3">
+          <wp:inline distT="0" distB="0" distL="0" distR="0" wp14:anchorId="7A644130" wp14:editId="532E0968">
             <wp:extent cx="6264910" cy="1735808"/>
             <wp:effectExtent l="0" t="0" r="2540" b="0"/>
             <wp:docPr id="20" name="Imagen 20" descr="Semana día a día"/>
@@ -10548,7 +10548,7 @@
           <w:rFonts w:eastAsia="Times New Roman"/>
           <w:lang w:val="es-ES"/>
         </w:rPr>
-        <w:pict w14:anchorId="3336C5CF">
+        <w:pict w14:anchorId="09C07A92">
           <v:rect id="_x0000_i1045" style="width:0;height:1.5pt" o:hralign="center" o:hrstd="t" o:hr="t" fillcolor="#a0a0a0" stroked="f"/>
         </w:pict>
       </w:r>
@@ -12088,28 +12088,14 @@
           <w:rFonts w:eastAsia="Times New Roman"/>
           <w:lang w:val="es-ES"/>
         </w:rPr>
-        <w:t xml:space="preserve"> (fichas 1 a 24). Resúmenes por sprint: </w:t>
+        <w:t xml:space="preserve"> (fichas 1 a 24). Resúmenes por sprint y notas de investigación: </w:t>
       </w:r>
       <w:r>
         <w:rPr>
           <w:rStyle w:val="CdigoHTML"/>
           <w:lang w:val="es-ES"/>
         </w:rPr>
-        <w:t>reports/joan/</w:t>
-      </w:r>
-      <w:r>
-        <w:rPr>
-          <w:rFonts w:eastAsia="Times New Roman"/>
-          <w:lang w:val="es-ES"/>
-        </w:rPr>
-        <w:t xml:space="preserve">, </w:t>
-      </w:r>
-      <w:r>
-        <w:rPr>
-          <w:rStyle w:val="CdigoHTML"/>
-          <w:lang w:val="es-ES"/>
-        </w:rPr>
-        <w:t>reports/pardo/</w:t>
+        <w:t>docs/sprints/</w:t>
       </w:r>
       <w:r>
         <w:rPr>
@@ -12315,235 +12301,9 @@
 <file path=word/numbering.xml><?xml version="1.0" encoding="utf-8"?>
 <w:numbering xmlns:wpc="http://schemas.microsoft.com/office/word/2010/wordprocessingCanvas" xmlns:cx="http://schemas.microsoft.com/office/drawing/2014/chartex" xmlns:cx1="http://schemas.microsoft.com/office/drawing/2015/9/8/chartex" xmlns:cx2="http://schemas.microsoft.com/office/drawing/2015/10/21/chartex" xmlns:cx3="http://schemas.microsoft.com/office/drawing/2016/5/9/chartex" xmlns:cx4="http://schemas.microsoft.com/office/drawing/2016/5/10/chartex" xmlns:cx5="http://schemas.microsoft.com/office/drawing/2016/5/11/chartex" xmlns:cx6="http://schemas.microsoft.com/office/drawing/2016/5/12/chartex" xmlns:cx7="http://schemas.microsoft.com/office/drawing/2016/5/13/chartex" xmlns:cx8="http://schemas.microsoft.com/office/drawing/2016/5/14/chartex" xmlns:mc="http://schemas.openxmlformats.org/markup-compatibility/2006" xmlns:aink="http://schemas.microsoft.com/office/drawing/2016/ink" xmlns:am3d="http://schemas.microsoft.com/office/drawing/2017/model3d" xmlns:o="urn:schemas-microsoft-com:office:office" xmlns:r="http://schemas.openxmlformats.org/officeDocument/2006/relationships" xmlns:m="http://schemas.openxmlformats.org/officeDocument/2006/math" xmlns:v="urn:schemas-microsoft-com:vml" xmlns:wp14="http://schemas.microsoft.com/office/word/2010/wordprocessingDrawing" xmlns:wp="http://schemas.openxmlformats.org/drawingml/2006/wordprocessingDrawing" xmlns:w10="urn:schemas-microsoft-com:office:word" xmlns:w="http://schemas.openxmlformats.org/wordprocessingml/2006/main" xmlns:w14="http://schemas.microsoft.com/office/word/2010/wordml" xmlns:w15="http://schemas.microsoft.com/office/word/2012/wordml" xmlns:w16cex="http://schemas.microsoft.com/office/word/2018/wordml/cex" xmlns:w16cid="http://schemas.microsoft.com/office/word/2016/wordml/cid" xmlns:w16="http://schemas.microsoft.com/office/word/2018/wordml" xmlns:w16sdtdh="http://schemas.microsoft.com/office/word/2020/wordml/sdtdatahash" xmlns:w16se="http://schemas.microsoft.com/office/word/2015/wordml/symex" xmlns:wpg="http://schemas.microsoft.com/office/word/2010/wordprocessingGroup" xmlns:wpi="http://schemas.microsoft.com/office/word/2010/wordprocessingInk" xmlns:wne="http://schemas.microsoft.com/office/word/2006/wordml" xmlns:wps="http://schemas.microsoft.com/office/word/2010/wordprocessingShape" mc:Ignorable="w14 w15 w16se w16cid w16 w16cex w16sdtdh wp14">
   <w:abstractNum w:abstractNumId="0" w15:restartNumberingAfterBreak="0">
-    <w:nsid w:val="023D0404"/>
+    <w:nsid w:val="0A4F258C"/>
     <w:multiLevelType w:val="multilevel"/>
-    <w:tmpl w:val="974A9596"/>
-    <w:lvl w:ilvl="0">
-      <w:start w:val="1"/>
-      <w:numFmt w:val="decimal"/>
-      <w:lvlText w:val="%1."/>
-      <w:lvlJc w:val="left"/>
-      <w:pPr>
-        <w:tabs>
-          <w:tab w:val="num" w:pos="720"/>
-        </w:tabs>
-        <w:ind w:left="720" w:hanging="360"/>
-      </w:pPr>
-    </w:lvl>
-    <w:lvl w:ilvl="1" w:tentative="1">
-      <w:start w:val="1"/>
-      <w:numFmt w:val="decimal"/>
-      <w:lvlText w:val="%2."/>
-      <w:lvlJc w:val="left"/>
-      <w:pPr>
-        <w:tabs>
-          <w:tab w:val="num" w:pos="1440"/>
-        </w:tabs>
-        <w:ind w:left="1440" w:hanging="360"/>
-      </w:pPr>
-    </w:lvl>
-    <w:lvl w:ilvl="2" w:tentative="1">
-      <w:start w:val="1"/>
-      <w:numFmt w:val="decimal"/>
-      <w:lvlText w:val="%3."/>
-      <w:lvlJc w:val="left"/>
-      <w:pPr>
-        <w:tabs>
-          <w:tab w:val="num" w:pos="2160"/>
-        </w:tabs>
-        <w:ind w:left="2160" w:hanging="360"/>
-      </w:pPr>
-    </w:lvl>
-    <w:lvl w:ilvl="3" w:tentative="1">
-      <w:start w:val="1"/>
-      <w:numFmt w:val="decimal"/>
-      <w:lvlText w:val="%4."/>
-      <w:lvlJc w:val="left"/>
-      <w:pPr>
-        <w:tabs>
-          <w:tab w:val="num" w:pos="2880"/>
-        </w:tabs>
-        <w:ind w:left="2880" w:hanging="360"/>
-      </w:pPr>
-    </w:lvl>
-    <w:lvl w:ilvl="4" w:tentative="1">
-      <w:start w:val="1"/>
-      <w:numFmt w:val="decimal"/>
-      <w:lvlText w:val="%5."/>
-      <w:lvlJc w:val="left"/>
-      <w:pPr>
-        <w:tabs>
-          <w:tab w:val="num" w:pos="3600"/>
-        </w:tabs>
-        <w:ind w:left="3600" w:hanging="360"/>
-      </w:pPr>
-    </w:lvl>
-    <w:lvl w:ilvl="5" w:tentative="1">
-      <w:start w:val="1"/>
-      <w:numFmt w:val="decimal"/>
-      <w:lvlText w:val="%6."/>
-      <w:lvlJc w:val="left"/>
-      <w:pPr>
-        <w:tabs>
-          <w:tab w:val="num" w:pos="4320"/>
-        </w:tabs>
-        <w:ind w:left="4320" w:hanging="360"/>
-      </w:pPr>
-    </w:lvl>
-    <w:lvl w:ilvl="6" w:tentative="1">
-      <w:start w:val="1"/>
-      <w:numFmt w:val="decimal"/>
-      <w:lvlText w:val="%7."/>
-      <w:lvlJc w:val="left"/>
-      <w:pPr>
-        <w:tabs>
-          <w:tab w:val="num" w:pos="5040"/>
-        </w:tabs>
-        <w:ind w:left="5040" w:hanging="360"/>
-      </w:pPr>
-    </w:lvl>
-    <w:lvl w:ilvl="7" w:tentative="1">
-      <w:start w:val="1"/>
-      <w:numFmt w:val="decimal"/>
-      <w:lvlText w:val="%8."/>
-      <w:lvlJc w:val="left"/>
-      <w:pPr>
-        <w:tabs>
-          <w:tab w:val="num" w:pos="5760"/>
-        </w:tabs>
-        <w:ind w:left="5760" w:hanging="360"/>
-      </w:pPr>
-    </w:lvl>
-    <w:lvl w:ilvl="8" w:tentative="1">
-      <w:start w:val="1"/>
-      <w:numFmt w:val="decimal"/>
-      <w:lvlText w:val="%9."/>
-      <w:lvlJc w:val="left"/>
-      <w:pPr>
-        <w:tabs>
-          <w:tab w:val="num" w:pos="6480"/>
-        </w:tabs>
-        <w:ind w:left="6480" w:hanging="360"/>
-      </w:pPr>
-    </w:lvl>
-  </w:abstractNum>
-  <w:abstractNum w:abstractNumId="1" w15:restartNumberingAfterBreak="0">
-    <w:nsid w:val="047F22CE"/>
-    <w:multiLevelType w:val="multilevel"/>
-    <w:tmpl w:val="D52EBD80"/>
-    <w:lvl w:ilvl="0">
-      <w:start w:val="1"/>
-      <w:numFmt w:val="decimal"/>
-      <w:lvlText w:val="%1."/>
-      <w:lvlJc w:val="left"/>
-      <w:pPr>
-        <w:tabs>
-          <w:tab w:val="num" w:pos="720"/>
-        </w:tabs>
-        <w:ind w:left="720" w:hanging="360"/>
-      </w:pPr>
-    </w:lvl>
-    <w:lvl w:ilvl="1" w:tentative="1">
-      <w:start w:val="1"/>
-      <w:numFmt w:val="decimal"/>
-      <w:lvlText w:val="%2."/>
-      <w:lvlJc w:val="left"/>
-      <w:pPr>
-        <w:tabs>
-          <w:tab w:val="num" w:pos="1440"/>
-        </w:tabs>
-        <w:ind w:left="1440" w:hanging="360"/>
-      </w:pPr>
-    </w:lvl>
-    <w:lvl w:ilvl="2" w:tentative="1">
-      <w:start w:val="1"/>
-      <w:numFmt w:val="decimal"/>
-      <w:lvlText w:val="%3."/>
-      <w:lvlJc w:val="left"/>
-      <w:pPr>
-        <w:tabs>
-          <w:tab w:val="num" w:pos="2160"/>
-        </w:tabs>
-        <w:ind w:left="2160" w:hanging="360"/>
-      </w:pPr>
-    </w:lvl>
-    <w:lvl w:ilvl="3" w:tentative="1">
-      <w:start w:val="1"/>
-      <w:numFmt w:val="decimal"/>
-      <w:lvlText w:val="%4."/>
-      <w:lvlJc w:val="left"/>
-      <w:pPr>
-        <w:tabs>
-          <w:tab w:val="num" w:pos="2880"/>
-        </w:tabs>
-        <w:ind w:left="2880" w:hanging="360"/>
-      </w:pPr>
-    </w:lvl>
-    <w:lvl w:ilvl="4" w:tentative="1">
-      <w:start w:val="1"/>
-      <w:numFmt w:val="decimal"/>
-      <w:lvlText w:val="%5."/>
-      <w:lvlJc w:val="left"/>
-      <w:pPr>
-        <w:tabs>
-          <w:tab w:val="num" w:pos="3600"/>
-        </w:tabs>
-        <w:ind w:left="3600" w:hanging="360"/>
-      </w:pPr>
-    </w:lvl>
-    <w:lvl w:ilvl="5" w:tentative="1">
-      <w:start w:val="1"/>
-      <w:numFmt w:val="decimal"/>
-      <w:lvlText w:val="%6."/>
-      <w:lvlJc w:val="left"/>
-      <w:pPr>
-        <w:tabs>
-          <w:tab w:val="num" w:pos="4320"/>
-        </w:tabs>
-        <w:ind w:left="4320" w:hanging="360"/>
-      </w:pPr>
-    </w:lvl>
-    <w:lvl w:ilvl="6" w:tentative="1">
-      <w:start w:val="1"/>
-      <w:numFmt w:val="decimal"/>
-      <w:lvlText w:val="%7."/>
-      <w:lvlJc w:val="left"/>
-      <w:pPr>
-        <w:tabs>
-          <w:tab w:val="num" w:pos="5040"/>
-        </w:tabs>
-        <w:ind w:left="5040" w:hanging="360"/>
-      </w:pPr>
-    </w:lvl>
-    <w:lvl w:ilvl="7" w:tentative="1">
-      <w:start w:val="1"/>
-      <w:numFmt w:val="decimal"/>
-      <w:lvlText w:val="%8."/>
-      <w:lvlJc w:val="left"/>
-      <w:pPr>
-        <w:tabs>
-          <w:tab w:val="num" w:pos="5760"/>
-        </w:tabs>
-        <w:ind w:left="5760" w:hanging="360"/>
-      </w:pPr>
-    </w:lvl>
-    <w:lvl w:ilvl="8" w:tentative="1">
-      <w:start w:val="1"/>
-      <w:numFmt w:val="decimal"/>
-      <w:lvlText w:val="%9."/>
-      <w:lvlJc w:val="left"/>
-      <w:pPr>
-        <w:tabs>
-          <w:tab w:val="num" w:pos="6480"/>
-        </w:tabs>
-        <w:ind w:left="6480" w:hanging="360"/>
-      </w:pPr>
-    </w:lvl>
-  </w:abstractNum>
-  <w:abstractNum w:abstractNumId="2" w15:restartNumberingAfterBreak="0">
-    <w:nsid w:val="06F62A5C"/>
-    <w:multiLevelType w:val="multilevel"/>
-    <w:tmpl w:val="95F2D00C"/>
+    <w:tmpl w:val="3896269A"/>
     <w:lvl w:ilvl="0">
       <w:start w:val="1"/>
       <w:numFmt w:val="bullet"/>
@@ -12689,10 +12449,123 @@
       </w:rPr>
     </w:lvl>
   </w:abstractNum>
-  <w:abstractNum w:abstractNumId="3" w15:restartNumberingAfterBreak="0">
-    <w:nsid w:val="0D8D00A9"/>
+  <w:abstractNum w:abstractNumId="1" w15:restartNumberingAfterBreak="0">
+    <w:nsid w:val="107923C2"/>
     <w:multiLevelType w:val="multilevel"/>
-    <w:tmpl w:val="0DDCF90A"/>
+    <w:tmpl w:val="085C2A0A"/>
+    <w:lvl w:ilvl="0">
+      <w:start w:val="1"/>
+      <w:numFmt w:val="decimal"/>
+      <w:lvlText w:val="%1."/>
+      <w:lvlJc w:val="left"/>
+      <w:pPr>
+        <w:tabs>
+          <w:tab w:val="num" w:pos="720"/>
+        </w:tabs>
+        <w:ind w:left="720" w:hanging="360"/>
+      </w:pPr>
+    </w:lvl>
+    <w:lvl w:ilvl="1" w:tentative="1">
+      <w:start w:val="1"/>
+      <w:numFmt w:val="decimal"/>
+      <w:lvlText w:val="%2."/>
+      <w:lvlJc w:val="left"/>
+      <w:pPr>
+        <w:tabs>
+          <w:tab w:val="num" w:pos="1440"/>
+        </w:tabs>
+        <w:ind w:left="1440" w:hanging="360"/>
+      </w:pPr>
+    </w:lvl>
+    <w:lvl w:ilvl="2" w:tentative="1">
+      <w:start w:val="1"/>
+      <w:numFmt w:val="decimal"/>
+      <w:lvlText w:val="%3."/>
+      <w:lvlJc w:val="left"/>
+      <w:pPr>
+        <w:tabs>
+          <w:tab w:val="num" w:pos="2160"/>
+        </w:tabs>
+        <w:ind w:left="2160" w:hanging="360"/>
+      </w:pPr>
+    </w:lvl>
+    <w:lvl w:ilvl="3" w:tentative="1">
+      <w:start w:val="1"/>
+      <w:numFmt w:val="decimal"/>
+      <w:lvlText w:val="%4."/>
+      <w:lvlJc w:val="left"/>
+      <w:pPr>
+        <w:tabs>
+          <w:tab w:val="num" w:pos="2880"/>
+        </w:tabs>
+        <w:ind w:left="2880" w:hanging="360"/>
+      </w:pPr>
+    </w:lvl>
+    <w:lvl w:ilvl="4" w:tentative="1">
+      <w:start w:val="1"/>
+      <w:numFmt w:val="decimal"/>
+      <w:lvlText w:val="%5."/>
+      <w:lvlJc w:val="left"/>
+      <w:pPr>
+        <w:tabs>
+          <w:tab w:val="num" w:pos="3600"/>
+        </w:tabs>
+        <w:ind w:left="3600" w:hanging="360"/>
+      </w:pPr>
+    </w:lvl>
+    <w:lvl w:ilvl="5" w:tentative="1">
+      <w:start w:val="1"/>
+      <w:numFmt w:val="decimal"/>
+      <w:lvlText w:val="%6."/>
+      <w:lvlJc w:val="left"/>
+      <w:pPr>
+        <w:tabs>
+          <w:tab w:val="num" w:pos="4320"/>
+        </w:tabs>
+        <w:ind w:left="4320" w:hanging="360"/>
+      </w:pPr>
+    </w:lvl>
+    <w:lvl w:ilvl="6" w:tentative="1">
+      <w:start w:val="1"/>
+      <w:numFmt w:val="decimal"/>
+      <w:lvlText w:val="%7."/>
+      <w:lvlJc w:val="left"/>
+      <w:pPr>
+        <w:tabs>
+          <w:tab w:val="num" w:pos="5040"/>
+        </w:tabs>
+        <w:ind w:left="5040" w:hanging="360"/>
+      </w:pPr>
+    </w:lvl>
+    <w:lvl w:ilvl="7" w:tentative="1">
+      <w:start w:val="1"/>
+      <w:numFmt w:val="decimal"/>
+      <w:lvlText w:val="%8."/>
+      <w:lvlJc w:val="left"/>
+      <w:pPr>
+        <w:tabs>
+          <w:tab w:val="num" w:pos="5760"/>
+        </w:tabs>
+        <w:ind w:left="5760" w:hanging="360"/>
+      </w:pPr>
+    </w:lvl>
+    <w:lvl w:ilvl="8" w:tentative="1">
+      <w:start w:val="1"/>
+      <w:numFmt w:val="decimal"/>
+      <w:lvlText w:val="%9."/>
+      <w:lvlJc w:val="left"/>
+      <w:pPr>
+        <w:tabs>
+          <w:tab w:val="num" w:pos="6480"/>
+        </w:tabs>
+        <w:ind w:left="6480" w:hanging="360"/>
+      </w:pPr>
+    </w:lvl>
+  </w:abstractNum>
+  <w:abstractNum w:abstractNumId="2" w15:restartNumberingAfterBreak="0">
+    <w:nsid w:val="190B6D37"/>
+    <w:multiLevelType w:val="multilevel"/>
+    <w:tmpl w:val="36C46CC6"/>
     <w:lvl w:ilvl="0">
       <w:start w:val="1"/>
       <w:numFmt w:val="bullet"/>
@@ -12838,10 +12711,10 @@
       </w:rPr>
     </w:lvl>
   </w:abstractNum>
-  <w:abstractNum w:abstractNumId="4" w15:restartNumberingAfterBreak="0">
-    <w:nsid w:val="1AFA25B8"/>
+  <w:abstractNum w:abstractNumId="3" w15:restartNumberingAfterBreak="0">
+    <w:nsid w:val="1D3D708E"/>
     <w:multiLevelType w:val="multilevel"/>
-    <w:tmpl w:val="60A06CA6"/>
+    <w:tmpl w:val="9A24BF5C"/>
     <w:lvl w:ilvl="0">
       <w:start w:val="1"/>
       <w:numFmt w:val="bullet"/>
@@ -12987,236 +12860,10 @@
       </w:rPr>
     </w:lvl>
   </w:abstractNum>
-  <w:abstractNum w:abstractNumId="5" w15:restartNumberingAfterBreak="0">
-    <w:nsid w:val="296C4040"/>
+  <w:abstractNum w:abstractNumId="4" w15:restartNumberingAfterBreak="0">
+    <w:nsid w:val="22DD204B"/>
     <w:multiLevelType w:val="multilevel"/>
-    <w:tmpl w:val="1390DC46"/>
-    <w:lvl w:ilvl="0">
-      <w:start w:val="1"/>
-      <w:numFmt w:val="decimal"/>
-      <w:lvlText w:val="%1."/>
-      <w:lvlJc w:val="left"/>
-      <w:pPr>
-        <w:tabs>
-          <w:tab w:val="num" w:pos="720"/>
-        </w:tabs>
-        <w:ind w:left="720" w:hanging="360"/>
-      </w:pPr>
-    </w:lvl>
-    <w:lvl w:ilvl="1" w:tentative="1">
-      <w:start w:val="1"/>
-      <w:numFmt w:val="decimal"/>
-      <w:lvlText w:val="%2."/>
-      <w:lvlJc w:val="left"/>
-      <w:pPr>
-        <w:tabs>
-          <w:tab w:val="num" w:pos="1440"/>
-        </w:tabs>
-        <w:ind w:left="1440" w:hanging="360"/>
-      </w:pPr>
-    </w:lvl>
-    <w:lvl w:ilvl="2" w:tentative="1">
-      <w:start w:val="1"/>
-      <w:numFmt w:val="decimal"/>
-      <w:lvlText w:val="%3."/>
-      <w:lvlJc w:val="left"/>
-      <w:pPr>
-        <w:tabs>
-          <w:tab w:val="num" w:pos="2160"/>
-        </w:tabs>
-        <w:ind w:left="2160" w:hanging="360"/>
-      </w:pPr>
-    </w:lvl>
-    <w:lvl w:ilvl="3" w:tentative="1">
-      <w:start w:val="1"/>
-      <w:numFmt w:val="decimal"/>
-      <w:lvlText w:val="%4."/>
-      <w:lvlJc w:val="left"/>
-      <w:pPr>
-        <w:tabs>
-          <w:tab w:val="num" w:pos="2880"/>
-        </w:tabs>
-        <w:ind w:left="2880" w:hanging="360"/>
-      </w:pPr>
-    </w:lvl>
-    <w:lvl w:ilvl="4" w:tentative="1">
-      <w:start w:val="1"/>
-      <w:numFmt w:val="decimal"/>
-      <w:lvlText w:val="%5."/>
-      <w:lvlJc w:val="left"/>
-      <w:pPr>
-        <w:tabs>
-          <w:tab w:val="num" w:pos="3600"/>
-        </w:tabs>
-        <w:ind w:left="3600" w:hanging="360"/>
-      </w:pPr>
-    </w:lvl>
-    <w:lvl w:ilvl="5" w:tentative="1">
-      <w:start w:val="1"/>
-      <w:numFmt w:val="decimal"/>
-      <w:lvlText w:val="%6."/>
-      <w:lvlJc w:val="left"/>
-      <w:pPr>
-        <w:tabs>
-          <w:tab w:val="num" w:pos="4320"/>
-        </w:tabs>
-        <w:ind w:left="4320" w:hanging="360"/>
-      </w:pPr>
-    </w:lvl>
-    <w:lvl w:ilvl="6" w:tentative="1">
-      <w:start w:val="1"/>
-      <w:numFmt w:val="decimal"/>
-      <w:lvlText w:val="%7."/>
-      <w:lvlJc w:val="left"/>
-      <w:pPr>
-        <w:tabs>
-          <w:tab w:val="num" w:pos="5040"/>
-        </w:tabs>
-        <w:ind w:left="5040" w:hanging="360"/>
-      </w:pPr>
-    </w:lvl>
-    <w:lvl w:ilvl="7" w:tentative="1">
-      <w:start w:val="1"/>
-      <w:numFmt w:val="decimal"/>
-      <w:lvlText w:val="%8."/>
-      <w:lvlJc w:val="left"/>
-      <w:pPr>
-        <w:tabs>
-          <w:tab w:val="num" w:pos="5760"/>
-        </w:tabs>
-        <w:ind w:left="5760" w:hanging="360"/>
-      </w:pPr>
-    </w:lvl>
-    <w:lvl w:ilvl="8" w:tentative="1">
-      <w:start w:val="1"/>
-      <w:numFmt w:val="decimal"/>
-      <w:lvlText w:val="%9."/>
-      <w:lvlJc w:val="left"/>
-      <w:pPr>
-        <w:tabs>
-          <w:tab w:val="num" w:pos="6480"/>
-        </w:tabs>
-        <w:ind w:left="6480" w:hanging="360"/>
-      </w:pPr>
-    </w:lvl>
-  </w:abstractNum>
-  <w:abstractNum w:abstractNumId="6" w15:restartNumberingAfterBreak="0">
-    <w:nsid w:val="3E9A5F6B"/>
-    <w:multiLevelType w:val="multilevel"/>
-    <w:tmpl w:val="BD82D098"/>
-    <w:lvl w:ilvl="0">
-      <w:start w:val="1"/>
-      <w:numFmt w:val="decimal"/>
-      <w:lvlText w:val="%1."/>
-      <w:lvlJc w:val="left"/>
-      <w:pPr>
-        <w:tabs>
-          <w:tab w:val="num" w:pos="720"/>
-        </w:tabs>
-        <w:ind w:left="720" w:hanging="360"/>
-      </w:pPr>
-    </w:lvl>
-    <w:lvl w:ilvl="1" w:tentative="1">
-      <w:start w:val="1"/>
-      <w:numFmt w:val="decimal"/>
-      <w:lvlText w:val="%2."/>
-      <w:lvlJc w:val="left"/>
-      <w:pPr>
-        <w:tabs>
-          <w:tab w:val="num" w:pos="1440"/>
-        </w:tabs>
-        <w:ind w:left="1440" w:hanging="360"/>
-      </w:pPr>
-    </w:lvl>
-    <w:lvl w:ilvl="2" w:tentative="1">
-      <w:start w:val="1"/>
-      <w:numFmt w:val="decimal"/>
-      <w:lvlText w:val="%3."/>
-      <w:lvlJc w:val="left"/>
-      <w:pPr>
-        <w:tabs>
-          <w:tab w:val="num" w:pos="2160"/>
-        </w:tabs>
-        <w:ind w:left="2160" w:hanging="360"/>
-      </w:pPr>
-    </w:lvl>
-    <w:lvl w:ilvl="3" w:tentative="1">
-      <w:start w:val="1"/>
-      <w:numFmt w:val="decimal"/>
-      <w:lvlText w:val="%4."/>
-      <w:lvlJc w:val="left"/>
-      <w:pPr>
-        <w:tabs>
-          <w:tab w:val="num" w:pos="2880"/>
-        </w:tabs>
-        <w:ind w:left="2880" w:hanging="360"/>
-      </w:pPr>
-    </w:lvl>
-    <w:lvl w:ilvl="4" w:tentative="1">
-      <w:start w:val="1"/>
-      <w:numFmt w:val="decimal"/>
-      <w:lvlText w:val="%5."/>
-      <w:lvlJc w:val="left"/>
-      <w:pPr>
-        <w:tabs>
-          <w:tab w:val="num" w:pos="3600"/>
-        </w:tabs>
-        <w:ind w:left="3600" w:hanging="360"/>
-      </w:pPr>
-    </w:lvl>
-    <w:lvl w:ilvl="5" w:tentative="1">
-      <w:start w:val="1"/>
-      <w:numFmt w:val="decimal"/>
-      <w:lvlText w:val="%6."/>
-      <w:lvlJc w:val="left"/>
-      <w:pPr>
-        <w:tabs>
-          <w:tab w:val="num" w:pos="4320"/>
-        </w:tabs>
-        <w:ind w:left="4320" w:hanging="360"/>
-      </w:pPr>
-    </w:lvl>
-    <w:lvl w:ilvl="6" w:tentative="1">
-      <w:start w:val="1"/>
-      <w:numFmt w:val="decimal"/>
-      <w:lvlText w:val="%7."/>
-      <w:lvlJc w:val="left"/>
-      <w:pPr>
-        <w:tabs>
-          <w:tab w:val="num" w:pos="5040"/>
-        </w:tabs>
-        <w:ind w:left="5040" w:hanging="360"/>
-      </w:pPr>
-    </w:lvl>
-    <w:lvl w:ilvl="7" w:tentative="1">
-      <w:start w:val="1"/>
-      <w:numFmt w:val="decimal"/>
-      <w:lvlText w:val="%8."/>
-      <w:lvlJc w:val="left"/>
-      <w:pPr>
-        <w:tabs>
-          <w:tab w:val="num" w:pos="5760"/>
-        </w:tabs>
-        <w:ind w:left="5760" w:hanging="360"/>
-      </w:pPr>
-    </w:lvl>
-    <w:lvl w:ilvl="8" w:tentative="1">
-      <w:start w:val="1"/>
-      <w:numFmt w:val="decimal"/>
-      <w:lvlText w:val="%9."/>
-      <w:lvlJc w:val="left"/>
-      <w:pPr>
-        <w:tabs>
-          <w:tab w:val="num" w:pos="6480"/>
-        </w:tabs>
-        <w:ind w:left="6480" w:hanging="360"/>
-      </w:pPr>
-    </w:lvl>
-  </w:abstractNum>
-  <w:abstractNum w:abstractNumId="7" w15:restartNumberingAfterBreak="0">
-    <w:nsid w:val="3F0B3D4C"/>
-    <w:multiLevelType w:val="multilevel"/>
-    <w:tmpl w:val="A628B862"/>
+    <w:tmpl w:val="45D8CE7E"/>
     <w:lvl w:ilvl="0">
       <w:start w:val="1"/>
       <w:numFmt w:val="bullet"/>
@@ -13362,10 +13009,123 @@
       </w:rPr>
     </w:lvl>
   </w:abstractNum>
-  <w:abstractNum w:abstractNumId="8" w15:restartNumberingAfterBreak="0">
-    <w:nsid w:val="3F1715F1"/>
+  <w:abstractNum w:abstractNumId="5" w15:restartNumberingAfterBreak="0">
+    <w:nsid w:val="27214894"/>
     <w:multiLevelType w:val="multilevel"/>
-    <w:tmpl w:val="C06C66A8"/>
+    <w:tmpl w:val="12B277E2"/>
+    <w:lvl w:ilvl="0">
+      <w:start w:val="1"/>
+      <w:numFmt w:val="decimal"/>
+      <w:lvlText w:val="%1."/>
+      <w:lvlJc w:val="left"/>
+      <w:pPr>
+        <w:tabs>
+          <w:tab w:val="num" w:pos="720"/>
+        </w:tabs>
+        <w:ind w:left="720" w:hanging="360"/>
+      </w:pPr>
+    </w:lvl>
+    <w:lvl w:ilvl="1" w:tentative="1">
+      <w:start w:val="1"/>
+      <w:numFmt w:val="decimal"/>
+      <w:lvlText w:val="%2."/>
+      <w:lvlJc w:val="left"/>
+      <w:pPr>
+        <w:tabs>
+          <w:tab w:val="num" w:pos="1440"/>
+        </w:tabs>
+        <w:ind w:left="1440" w:hanging="360"/>
+      </w:pPr>
+    </w:lvl>
+    <w:lvl w:ilvl="2" w:tentative="1">
+      <w:start w:val="1"/>
+      <w:numFmt w:val="decimal"/>
+      <w:lvlText w:val="%3."/>
+      <w:lvlJc w:val="left"/>
+      <w:pPr>
+        <w:tabs>
+          <w:tab w:val="num" w:pos="2160"/>
+        </w:tabs>
+        <w:ind w:left="2160" w:hanging="360"/>
+      </w:pPr>
+    </w:lvl>
+    <w:lvl w:ilvl="3" w:tentative="1">
+      <w:start w:val="1"/>
+      <w:numFmt w:val="decimal"/>
+      <w:lvlText w:val="%4."/>
+      <w:lvlJc w:val="left"/>
+      <w:pPr>
+        <w:tabs>
+          <w:tab w:val="num" w:pos="2880"/>
+        </w:tabs>
+        <w:ind w:left="2880" w:hanging="360"/>
+      </w:pPr>
+    </w:lvl>
+    <w:lvl w:ilvl="4" w:tentative="1">
+      <w:start w:val="1"/>
+      <w:numFmt w:val="decimal"/>
+      <w:lvlText w:val="%5."/>
+      <w:lvlJc w:val="left"/>
+      <w:pPr>
+        <w:tabs>
+          <w:tab w:val="num" w:pos="3600"/>
+        </w:tabs>
+        <w:ind w:left="3600" w:hanging="360"/>
+      </w:pPr>
+    </w:lvl>
+    <w:lvl w:ilvl="5" w:tentative="1">
+      <w:start w:val="1"/>
+      <w:numFmt w:val="decimal"/>
+      <w:lvlText w:val="%6."/>
+      <w:lvlJc w:val="left"/>
+      <w:pPr>
+        <w:tabs>
+          <w:tab w:val="num" w:pos="4320"/>
+        </w:tabs>
+        <w:ind w:left="4320" w:hanging="360"/>
+      </w:pPr>
+    </w:lvl>
+    <w:lvl w:ilvl="6" w:tentative="1">
+      <w:start w:val="1"/>
+      <w:numFmt w:val="decimal"/>
+      <w:lvlText w:val="%7."/>
+      <w:lvlJc w:val="left"/>
+      <w:pPr>
+        <w:tabs>
+          <w:tab w:val="num" w:pos="5040"/>
+        </w:tabs>
+        <w:ind w:left="5040" w:hanging="360"/>
+      </w:pPr>
+    </w:lvl>
+    <w:lvl w:ilvl="7" w:tentative="1">
+      <w:start w:val="1"/>
+      <w:numFmt w:val="decimal"/>
+      <w:lvlText w:val="%8."/>
+      <w:lvlJc w:val="left"/>
+      <w:pPr>
+        <w:tabs>
+          <w:tab w:val="num" w:pos="5760"/>
+        </w:tabs>
+        <w:ind w:left="5760" w:hanging="360"/>
+      </w:pPr>
+    </w:lvl>
+    <w:lvl w:ilvl="8" w:tentative="1">
+      <w:start w:val="1"/>
+      <w:numFmt w:val="decimal"/>
+      <w:lvlText w:val="%9."/>
+      <w:lvlJc w:val="left"/>
+      <w:pPr>
+        <w:tabs>
+          <w:tab w:val="num" w:pos="6480"/>
+        </w:tabs>
+        <w:ind w:left="6480" w:hanging="360"/>
+      </w:pPr>
+    </w:lvl>
+  </w:abstractNum>
+  <w:abstractNum w:abstractNumId="6" w15:restartNumberingAfterBreak="0">
+    <w:nsid w:val="4AE9033D"/>
+    <w:multiLevelType w:val="multilevel"/>
+    <w:tmpl w:val="BAEA1602"/>
     <w:lvl w:ilvl="0">
       <w:start w:val="1"/>
       <w:numFmt w:val="bullet"/>
@@ -13511,10 +13271,123 @@
       </w:rPr>
     </w:lvl>
   </w:abstractNum>
-  <w:abstractNum w:abstractNumId="9" w15:restartNumberingAfterBreak="0">
-    <w:nsid w:val="445D6E33"/>
+  <w:abstractNum w:abstractNumId="7" w15:restartNumberingAfterBreak="0">
+    <w:nsid w:val="4D7425AF"/>
     <w:multiLevelType w:val="multilevel"/>
-    <w:tmpl w:val="C450B6DE"/>
+    <w:tmpl w:val="DFDA3582"/>
+    <w:lvl w:ilvl="0">
+      <w:start w:val="1"/>
+      <w:numFmt w:val="decimal"/>
+      <w:lvlText w:val="%1."/>
+      <w:lvlJc w:val="left"/>
+      <w:pPr>
+        <w:tabs>
+          <w:tab w:val="num" w:pos="720"/>
+        </w:tabs>
+        <w:ind w:left="720" w:hanging="360"/>
+      </w:pPr>
+    </w:lvl>
+    <w:lvl w:ilvl="1" w:tentative="1">
+      <w:start w:val="1"/>
+      <w:numFmt w:val="decimal"/>
+      <w:lvlText w:val="%2."/>
+      <w:lvlJc w:val="left"/>
+      <w:pPr>
+        <w:tabs>
+          <w:tab w:val="num" w:pos="1440"/>
+        </w:tabs>
+        <w:ind w:left="1440" w:hanging="360"/>
+      </w:pPr>
+    </w:lvl>
+    <w:lvl w:ilvl="2" w:tentative="1">
+      <w:start w:val="1"/>
+      <w:numFmt w:val="decimal"/>
+      <w:lvlText w:val="%3."/>
+      <w:lvlJc w:val="left"/>
+      <w:pPr>
+        <w:tabs>
+          <w:tab w:val="num" w:pos="2160"/>
+        </w:tabs>
+        <w:ind w:left="2160" w:hanging="360"/>
+      </w:pPr>
+    </w:lvl>
+    <w:lvl w:ilvl="3" w:tentative="1">
+      <w:start w:val="1"/>
+      <w:numFmt w:val="decimal"/>
+      <w:lvlText w:val="%4."/>
+      <w:lvlJc w:val="left"/>
+      <w:pPr>
+        <w:tabs>
+          <w:tab w:val="num" w:pos="2880"/>
+        </w:tabs>
+        <w:ind w:left="2880" w:hanging="360"/>
+      </w:pPr>
+    </w:lvl>
+    <w:lvl w:ilvl="4" w:tentative="1">
+      <w:start w:val="1"/>
+      <w:numFmt w:val="decimal"/>
+      <w:lvlText w:val="%5."/>
+      <w:lvlJc w:val="left"/>
+      <w:pPr>
+        <w:tabs>
+          <w:tab w:val="num" w:pos="3600"/>
+        </w:tabs>
+        <w:ind w:left="3600" w:hanging="360"/>
+      </w:pPr>
+    </w:lvl>
+    <w:lvl w:ilvl="5" w:tentative="1">
+      <w:start w:val="1"/>
+      <w:numFmt w:val="decimal"/>
+      <w:lvlText w:val="%6."/>
+      <w:lvlJc w:val="left"/>
+      <w:pPr>
+        <w:tabs>
+          <w:tab w:val="num" w:pos="4320"/>
+        </w:tabs>
+        <w:ind w:left="4320" w:hanging="360"/>
+      </w:pPr>
+    </w:lvl>
+    <w:lvl w:ilvl="6" w:tentative="1">
+      <w:start w:val="1"/>
+      <w:numFmt w:val="decimal"/>
+      <w:lvlText w:val="%7."/>
+      <w:lvlJc w:val="left"/>
+      <w:pPr>
+        <w:tabs>
+          <w:tab w:val="num" w:pos="5040"/>
+        </w:tabs>
+        <w:ind w:left="5040" w:hanging="360"/>
+      </w:pPr>
+    </w:lvl>
+    <w:lvl w:ilvl="7" w:tentative="1">
+      <w:start w:val="1"/>
+      <w:numFmt w:val="decimal"/>
+      <w:lvlText w:val="%8."/>
+      <w:lvlJc w:val="left"/>
+      <w:pPr>
+        <w:tabs>
+          <w:tab w:val="num" w:pos="5760"/>
+        </w:tabs>
+        <w:ind w:left="5760" w:hanging="360"/>
+      </w:pPr>
+    </w:lvl>
+    <w:lvl w:ilvl="8" w:tentative="1">
+      <w:start w:val="1"/>
+      <w:numFmt w:val="decimal"/>
+      <w:lvlText w:val="%9."/>
+      <w:lvlJc w:val="left"/>
+      <w:pPr>
+        <w:tabs>
+          <w:tab w:val="num" w:pos="6480"/>
+        </w:tabs>
+        <w:ind w:left="6480" w:hanging="360"/>
+      </w:pPr>
+    </w:lvl>
+  </w:abstractNum>
+  <w:abstractNum w:abstractNumId="8" w15:restartNumberingAfterBreak="0">
+    <w:nsid w:val="5F4517D6"/>
+    <w:multiLevelType w:val="multilevel"/>
+    <w:tmpl w:val="51C2DA3C"/>
     <w:lvl w:ilvl="0">
       <w:start w:val="1"/>
       <w:numFmt w:val="bullet"/>
@@ -13660,10 +13533,10 @@
       </w:rPr>
     </w:lvl>
   </w:abstractNum>
-  <w:abstractNum w:abstractNumId="10" w15:restartNumberingAfterBreak="0">
-    <w:nsid w:val="732D4740"/>
+  <w:abstractNum w:abstractNumId="9" w15:restartNumberingAfterBreak="0">
+    <w:nsid w:val="720739E9"/>
     <w:multiLevelType w:val="multilevel"/>
-    <w:tmpl w:val="41D285D0"/>
+    <w:tmpl w:val="C05403E8"/>
     <w:lvl w:ilvl="0">
       <w:start w:val="1"/>
       <w:numFmt w:val="bullet"/>
@@ -13809,38 +13682,151 @@
       </w:rPr>
     </w:lvl>
   </w:abstractNum>
+  <w:abstractNum w:abstractNumId="10" w15:restartNumberingAfterBreak="0">
+    <w:nsid w:val="7A6B2A78"/>
+    <w:multiLevelType w:val="multilevel"/>
+    <w:tmpl w:val="DA64DF22"/>
+    <w:lvl w:ilvl="0">
+      <w:start w:val="1"/>
+      <w:numFmt w:val="decimal"/>
+      <w:lvlText w:val="%1."/>
+      <w:lvlJc w:val="left"/>
+      <w:pPr>
+        <w:tabs>
+          <w:tab w:val="num" w:pos="720"/>
+        </w:tabs>
+        <w:ind w:left="720" w:hanging="360"/>
+      </w:pPr>
+    </w:lvl>
+    <w:lvl w:ilvl="1" w:tentative="1">
+      <w:start w:val="1"/>
+      <w:numFmt w:val="decimal"/>
+      <w:lvlText w:val="%2."/>
+      <w:lvlJc w:val="left"/>
+      <w:pPr>
+        <w:tabs>
+          <w:tab w:val="num" w:pos="1440"/>
+        </w:tabs>
+        <w:ind w:left="1440" w:hanging="360"/>
+      </w:pPr>
+    </w:lvl>
+    <w:lvl w:ilvl="2" w:tentative="1">
+      <w:start w:val="1"/>
+      <w:numFmt w:val="decimal"/>
+      <w:lvlText w:val="%3."/>
+      <w:lvlJc w:val="left"/>
+      <w:pPr>
+        <w:tabs>
+          <w:tab w:val="num" w:pos="2160"/>
+        </w:tabs>
+        <w:ind w:left="2160" w:hanging="360"/>
+      </w:pPr>
+    </w:lvl>
+    <w:lvl w:ilvl="3" w:tentative="1">
+      <w:start w:val="1"/>
+      <w:numFmt w:val="decimal"/>
+      <w:lvlText w:val="%4."/>
+      <w:lvlJc w:val="left"/>
+      <w:pPr>
+        <w:tabs>
+          <w:tab w:val="num" w:pos="2880"/>
+        </w:tabs>
+        <w:ind w:left="2880" w:hanging="360"/>
+      </w:pPr>
+    </w:lvl>
+    <w:lvl w:ilvl="4" w:tentative="1">
+      <w:start w:val="1"/>
+      <w:numFmt w:val="decimal"/>
+      <w:lvlText w:val="%5."/>
+      <w:lvlJc w:val="left"/>
+      <w:pPr>
+        <w:tabs>
+          <w:tab w:val="num" w:pos="3600"/>
+        </w:tabs>
+        <w:ind w:left="3600" w:hanging="360"/>
+      </w:pPr>
+    </w:lvl>
+    <w:lvl w:ilvl="5" w:tentative="1">
+      <w:start w:val="1"/>
+      <w:numFmt w:val="decimal"/>
+      <w:lvlText w:val="%6."/>
+      <w:lvlJc w:val="left"/>
+      <w:pPr>
+        <w:tabs>
+          <w:tab w:val="num" w:pos="4320"/>
+        </w:tabs>
+        <w:ind w:left="4320" w:hanging="360"/>
+      </w:pPr>
+    </w:lvl>
+    <w:lvl w:ilvl="6" w:tentative="1">
+      <w:start w:val="1"/>
+      <w:numFmt w:val="decimal"/>
+      <w:lvlText w:val="%7."/>
+      <w:lvlJc w:val="left"/>
+      <w:pPr>
+        <w:tabs>
+          <w:tab w:val="num" w:pos="5040"/>
+        </w:tabs>
+        <w:ind w:left="5040" w:hanging="360"/>
+      </w:pPr>
+    </w:lvl>
+    <w:lvl w:ilvl="7" w:tentative="1">
+      <w:start w:val="1"/>
+      <w:numFmt w:val="decimal"/>
+      <w:lvlText w:val="%8."/>
+      <w:lvlJc w:val="left"/>
+      <w:pPr>
+        <w:tabs>
+          <w:tab w:val="num" w:pos="5760"/>
+        </w:tabs>
+        <w:ind w:left="5760" w:hanging="360"/>
+      </w:pPr>
+    </w:lvl>
+    <w:lvl w:ilvl="8" w:tentative="1">
+      <w:start w:val="1"/>
+      <w:numFmt w:val="decimal"/>
+      <w:lvlText w:val="%9."/>
+      <w:lvlJc w:val="left"/>
+      <w:pPr>
+        <w:tabs>
+          <w:tab w:val="num" w:pos="6480"/>
+        </w:tabs>
+        <w:ind w:left="6480" w:hanging="360"/>
+      </w:pPr>
+    </w:lvl>
+  </w:abstractNum>
   <w:num w:numId="1">
-    <w:abstractNumId w:val="6"/>
+    <w:abstractNumId w:val="10"/>
   </w:num>
   <w:num w:numId="2">
-    <w:abstractNumId w:val="2"/>
+    <w:abstractNumId w:val="6"/>
   </w:num>
   <w:num w:numId="3">
     <w:abstractNumId w:val="3"/>
   </w:num>
   <w:num w:numId="4">
-    <w:abstractNumId w:val="7"/>
+    <w:abstractNumId w:val="8"/>
   </w:num>
   <w:num w:numId="5">
     <w:abstractNumId w:val="9"/>
   </w:num>
   <w:num w:numId="6">
-    <w:abstractNumId w:val="10"/>
+    <w:abstractNumId w:val="4"/>
   </w:num>
   <w:num w:numId="7">
+    <w:abstractNumId w:val="5"/>
+  </w:num>
+  <w:num w:numId="8">
+    <w:abstractNumId w:val="7"/>
+  </w:num>
+  <w:num w:numId="9">
     <w:abstractNumId w:val="1"/>
   </w:num>
-  <w:num w:numId="8">
-    <w:abstractNumId w:val="5"/>
-  </w:num>
-  <w:num w:numId="9">
+  <w:num w:numId="10">
     <w:abstractNumId w:val="0"/>
   </w:num>
-  <w:num w:numId="10">
-    <w:abstractNumId w:val="4"/>
-  </w:num>
   <w:num w:numId="11">
-    <w:abstractNumId w:val="8"/>
+    <w:abstractNumId w:val="2"/>
   </w:num>
 </w:numbering>
 </file>
@@ -14428,7 +14414,7 @@
     <w:link w:val="EncabezadoCar"/>
     <w:uiPriority w:val="99"/>
     <w:unhideWhenUsed/>
-    <w:rsid w:val="00FE4195"/>
+    <w:rsid w:val="00635A72"/>
     <w:pPr>
       <w:tabs>
         <w:tab w:val="center" w:pos="4419"/>
@@ -14442,7 +14428,7 @@
     <w:basedOn w:val="Fuentedeprrafopredeter"/>
     <w:link w:val="Encabezado"/>
     <w:uiPriority w:val="99"/>
-    <w:rsid w:val="00FE4195"/>
+    <w:rsid w:val="00635A72"/>
     <w:rPr>
       <w:rFonts w:ascii="Calibri" w:eastAsiaTheme="minorEastAsia" w:hAnsi="Calibri" w:cs="Calibri"/>
       <w:szCs w:val="24"/>
@@ -14454,7 +14440,7 @@
     <w:link w:val="PiedepginaCar"/>
     <w:uiPriority w:val="99"/>
     <w:unhideWhenUsed/>
-    <w:rsid w:val="00FE4195"/>
+    <w:rsid w:val="00635A72"/>
     <w:pPr>
       <w:tabs>
         <w:tab w:val="center" w:pos="4419"/>
@@ -14468,7 +14454,7 @@
     <w:basedOn w:val="Fuentedeprrafopredeter"/>
     <w:link w:val="Piedepgina"/>
     <w:uiPriority w:val="99"/>
-    <w:rsid w:val="00FE4195"/>
+    <w:rsid w:val="00635A72"/>
     <w:rPr>
       <w:rFonts w:ascii="Calibri" w:eastAsiaTheme="minorEastAsia" w:hAnsi="Calibri" w:cs="Calibri"/>
       <w:szCs w:val="24"/>
@@ -14480,7 +14466,7 @@
     <w:uiPriority w:val="99"/>
     <w:semiHidden/>
     <w:unhideWhenUsed/>
-    <w:rsid w:val="00FE4195"/>
+    <w:rsid w:val="00635A72"/>
   </w:style>
 </w:styles>
 </file>

</xml_diff>